<commit_message>
feat(docs): add comprehensive guide for creating Microsoft Entra ID tenant and app registration
</commit_message>
<xml_diff>
--- a/Documentation/Creating org Microsoft account.docx
+++ b/Documentation/Creating org Microsoft account.docx
@@ -73,7 +73,7 @@
           <w:b/>
           <w:bCs/>
         </w:rPr>
-        <w:t>Try Azure for free</w:t>
+        <w:t>Pay as you go</w:t>
       </w:r>
       <w:r>
         <w:t>.</w:t>
@@ -82,14 +82,11 @@
         <w:br/>
       </w:r>
       <w:r>
-        <w:rPr>
-          <w:lang w:val="en-US"/>
-        </w:rPr>
         <w:drawing>
-          <wp:inline distT="0" distB="0" distL="0" distR="0" wp14:anchorId="74139F54" wp14:editId="188F627B">
-            <wp:extent cx="5731510" cy="2307590"/>
-            <wp:effectExtent l="0" t="0" r="2540" b="0"/>
-            <wp:docPr id="886861814" name="Picture 1"/>
+          <wp:inline distT="0" distB="0" distL="0" distR="0" wp14:anchorId="6397665F" wp14:editId="1F01B1C9">
+            <wp:extent cx="5731510" cy="2226310"/>
+            <wp:effectExtent l="0" t="0" r="2540" b="2540"/>
+            <wp:docPr id="1737522421" name="Picture 1"/>
             <wp:cNvGraphicFramePr>
               <a:graphicFrameLocks xmlns:a="http://schemas.openxmlformats.org/drawingml/2006/main" noChangeAspect="1"/>
             </wp:cNvGraphicFramePr>
@@ -97,7 +94,7 @@
               <a:graphicData uri="http://schemas.openxmlformats.org/drawingml/2006/picture">
                 <pic:pic xmlns:pic="http://schemas.openxmlformats.org/drawingml/2006/picture">
                   <pic:nvPicPr>
-                    <pic:cNvPr id="886861814" name=""/>
+                    <pic:cNvPr id="1737522421" name=""/>
                     <pic:cNvPicPr/>
                   </pic:nvPicPr>
                   <pic:blipFill>
@@ -109,7 +106,7 @@
                   <pic:spPr>
                     <a:xfrm>
                       <a:off x="0" y="0"/>
-                      <a:ext cx="5731510" cy="2307590"/>
+                      <a:ext cx="5731510" cy="2226310"/>
                     </a:xfrm>
                     <a:prstGeom prst="rect">
                       <a:avLst/>
@@ -174,6 +171,7 @@
         <w:rPr>
           <w:b/>
           <w:bCs/>
+          <w:noProof/>
         </w:rPr>
         <w:drawing>
           <wp:inline distT="0" distB="0" distL="0" distR="0" wp14:anchorId="16E572E3" wp14:editId="7B752862">
@@ -777,6 +775,7 @@
     <w:p>
       <w:r>
         <w:rPr>
+          <w:noProof/>
           <w:lang w:val="en-US"/>
         </w:rPr>
         <w:lastRenderedPageBreak/>
@@ -1181,10 +1180,7 @@
         </w:numPr>
       </w:pPr>
       <w:r>
-        <w:t xml:space="preserve">You are the individual identified on the </w:t>
-      </w:r>
-      <w:r>
-        <w:t>account,</w:t>
+        <w:t>You are the individual identified on the account,</w:t>
       </w:r>
       <w:r>
         <w:t xml:space="preserve"> and y</w:t>
@@ -1310,6 +1306,7 @@
     <w:p>
       <w:r>
         <w:rPr>
+          <w:noProof/>
           <w:lang w:val="en-US"/>
         </w:rPr>
         <w:lastRenderedPageBreak/>
@@ -1938,28 +1935,15 @@
     </w:p>
     <w:p>
       <w:pPr>
-        <w:rPr>
-          <w:b/>
-          <w:bCs/>
-        </w:rPr>
-      </w:pPr>
-      <w:r>
-        <w:rPr>
-          <w:b/>
-          <w:bCs/>
-        </w:rPr>
-        <w:t>5. Completion</w:t>
-      </w:r>
-    </w:p>
-    <w:p>
-      <w:r>
-        <w:t xml:space="preserve">After </w:t>
-      </w:r>
-      <w:r>
-        <w:t>all,</w:t>
-      </w:r>
-      <w:r>
-        <w:t xml:space="preserve"> three steps are successfully submitted:</w:t>
+        <w:pStyle w:val="Heading1"/>
+      </w:pPr>
+      <w:r>
+        <w:t>Completion</w:t>
+      </w:r>
+    </w:p>
+    <w:p>
+      <w:r>
+        <w:t>After all, three steps are successfully submitted:</w:t>
       </w:r>
     </w:p>
     <w:p>
@@ -2013,6 +1997,684 @@
       </w:pPr>
       <w:r>
         <w:t>You can immediately begin configuring users, groups, applications, and security settings</w:t>
+      </w:r>
+    </w:p>
+    <w:p>
+      <w:pPr>
+        <w:pStyle w:val="Heading1"/>
+      </w:pPr>
+      <w:r>
+        <w:t>Creating admin app registration</w:t>
+      </w:r>
+    </w:p>
+    <w:p>
+      <w:pPr>
+        <w:pStyle w:val="ListParagraph"/>
+        <w:numPr>
+          <w:ilvl w:val="0"/>
+          <w:numId w:val="10"/>
+        </w:numPr>
+      </w:pPr>
+      <w:r>
+        <w:t>Navigate to Entra admin centre</w:t>
+      </w:r>
+    </w:p>
+    <w:p>
+      <w:pPr>
+        <w:pStyle w:val="ListParagraph"/>
+        <w:numPr>
+          <w:ilvl w:val="0"/>
+          <w:numId w:val="10"/>
+        </w:numPr>
+      </w:pPr>
+      <w:r>
+        <w:lastRenderedPageBreak/>
+        <w:t>Look for App registrations and click on it</w:t>
+      </w:r>
+      <w:r>
+        <w:br/>
+      </w:r>
+      <w:r>
+        <w:drawing>
+          <wp:inline distT="0" distB="0" distL="0" distR="0" wp14:anchorId="66977342" wp14:editId="5B2D9021">
+            <wp:extent cx="2534004" cy="3458058"/>
+            <wp:effectExtent l="0" t="0" r="0" b="9525"/>
+            <wp:docPr id="1980621389" name="Picture 1"/>
+            <wp:cNvGraphicFramePr>
+              <a:graphicFrameLocks xmlns:a="http://schemas.openxmlformats.org/drawingml/2006/main" noChangeAspect="1"/>
+            </wp:cNvGraphicFramePr>
+            <a:graphic xmlns:a="http://schemas.openxmlformats.org/drawingml/2006/main">
+              <a:graphicData uri="http://schemas.openxmlformats.org/drawingml/2006/picture">
+                <pic:pic xmlns:pic="http://schemas.openxmlformats.org/drawingml/2006/picture">
+                  <pic:nvPicPr>
+                    <pic:cNvPr id="1980621389" name=""/>
+                    <pic:cNvPicPr/>
+                  </pic:nvPicPr>
+                  <pic:blipFill>
+                    <a:blip r:embed="rId11"/>
+                    <a:stretch>
+                      <a:fillRect/>
+                    </a:stretch>
+                  </pic:blipFill>
+                  <pic:spPr>
+                    <a:xfrm>
+                      <a:off x="0" y="0"/>
+                      <a:ext cx="2534004" cy="3458058"/>
+                    </a:xfrm>
+                    <a:prstGeom prst="rect">
+                      <a:avLst/>
+                    </a:prstGeom>
+                  </pic:spPr>
+                </pic:pic>
+              </a:graphicData>
+            </a:graphic>
+          </wp:inline>
+        </w:drawing>
+      </w:r>
+    </w:p>
+    <w:p>
+      <w:pPr>
+        <w:pStyle w:val="ListParagraph"/>
+        <w:numPr>
+          <w:ilvl w:val="0"/>
+          <w:numId w:val="10"/>
+        </w:numPr>
+      </w:pPr>
+      <w:r>
+        <w:t>Click on New registration</w:t>
+      </w:r>
+      <w:r>
+        <w:br/>
+      </w:r>
+      <w:r>
+        <w:drawing>
+          <wp:inline distT="0" distB="0" distL="0" distR="0" wp14:anchorId="4DA5193E" wp14:editId="5C0CFF06">
+            <wp:extent cx="5731510" cy="1604010"/>
+            <wp:effectExtent l="0" t="0" r="2540" b="0"/>
+            <wp:docPr id="916019642" name="Picture 1"/>
+            <wp:cNvGraphicFramePr>
+              <a:graphicFrameLocks xmlns:a="http://schemas.openxmlformats.org/drawingml/2006/main" noChangeAspect="1"/>
+            </wp:cNvGraphicFramePr>
+            <a:graphic xmlns:a="http://schemas.openxmlformats.org/drawingml/2006/main">
+              <a:graphicData uri="http://schemas.openxmlformats.org/drawingml/2006/picture">
+                <pic:pic xmlns:pic="http://schemas.openxmlformats.org/drawingml/2006/picture">
+                  <pic:nvPicPr>
+                    <pic:cNvPr id="916019642" name=""/>
+                    <pic:cNvPicPr/>
+                  </pic:nvPicPr>
+                  <pic:blipFill>
+                    <a:blip r:embed="rId12"/>
+                    <a:stretch>
+                      <a:fillRect/>
+                    </a:stretch>
+                  </pic:blipFill>
+                  <pic:spPr>
+                    <a:xfrm>
+                      <a:off x="0" y="0"/>
+                      <a:ext cx="5731510" cy="1604010"/>
+                    </a:xfrm>
+                    <a:prstGeom prst="rect">
+                      <a:avLst/>
+                    </a:prstGeom>
+                  </pic:spPr>
+                </pic:pic>
+              </a:graphicData>
+            </a:graphic>
+          </wp:inline>
+        </w:drawing>
+      </w:r>
+    </w:p>
+    <w:p>
+      <w:pPr>
+        <w:pStyle w:val="ListParagraph"/>
+        <w:numPr>
+          <w:ilvl w:val="0"/>
+          <w:numId w:val="10"/>
+        </w:numPr>
+      </w:pPr>
+      <w:r>
+        <w:t>Give the application a name like ‘</w:t>
+      </w:r>
+      <w:r>
+        <w:t>corpDeployer</w:t>
+      </w:r>
+      <w:r>
+        <w:t>’</w:t>
+      </w:r>
+    </w:p>
+    <w:p>
+      <w:pPr>
+        <w:pStyle w:val="ListParagraph"/>
+        <w:numPr>
+          <w:ilvl w:val="0"/>
+          <w:numId w:val="10"/>
+        </w:numPr>
+      </w:pPr>
+      <w:r>
+        <w:t>Choose Single tenant only as a Supported account type</w:t>
+      </w:r>
+    </w:p>
+    <w:p>
+      <w:pPr>
+        <w:pStyle w:val="ListParagraph"/>
+        <w:numPr>
+          <w:ilvl w:val="0"/>
+          <w:numId w:val="10"/>
+        </w:numPr>
+      </w:pPr>
+      <w:r>
+        <w:t xml:space="preserve">Click </w:t>
+      </w:r>
+      <w:r>
+        <w:rPr>
+          <w:b/>
+          <w:bCs/>
+        </w:rPr>
+        <w:t>Register</w:t>
+      </w:r>
+      <w:r>
+        <w:t xml:space="preserve"> at the bottom</w:t>
+      </w:r>
+    </w:p>
+    <w:p>
+      <w:pPr>
+        <w:pStyle w:val="ListParagraph"/>
+        <w:numPr>
+          <w:ilvl w:val="0"/>
+          <w:numId w:val="10"/>
+        </w:numPr>
+      </w:pPr>
+      <w:r>
+        <w:t>You will be taken to the app’s overview page. Copy the Application (client) ID and Directory (tenant) ID values somewhere secure to be accessed later.</w:t>
+      </w:r>
+    </w:p>
+    <w:p>
+      <w:pPr>
+        <w:pStyle w:val="ListParagraph"/>
+        <w:numPr>
+          <w:ilvl w:val="0"/>
+          <w:numId w:val="10"/>
+        </w:numPr>
+      </w:pPr>
+      <w:r>
+        <w:t xml:space="preserve">Go to </w:t>
+      </w:r>
+      <w:r>
+        <w:rPr>
+          <w:b/>
+          <w:bCs/>
+        </w:rPr>
+        <w:t>certificates and secrets</w:t>
+      </w:r>
+      <w:r>
+        <w:t xml:space="preserve"> from the overview page</w:t>
+      </w:r>
+    </w:p>
+    <w:p>
+      <w:pPr>
+        <w:pStyle w:val="ListParagraph"/>
+        <w:numPr>
+          <w:ilvl w:val="0"/>
+          <w:numId w:val="10"/>
+        </w:numPr>
+      </w:pPr>
+      <w:r>
+        <w:t xml:space="preserve">click </w:t>
+      </w:r>
+      <w:r>
+        <w:rPr>
+          <w:b/>
+          <w:bCs/>
+        </w:rPr>
+        <w:t>+ New client secret</w:t>
+      </w:r>
+    </w:p>
+    <w:p>
+      <w:pPr>
+        <w:pStyle w:val="ListParagraph"/>
+        <w:numPr>
+          <w:ilvl w:val="0"/>
+          <w:numId w:val="10"/>
+        </w:numPr>
+      </w:pPr>
+      <w:r>
+        <w:t>Add a description and select desired expiration date</w:t>
+      </w:r>
+    </w:p>
+    <w:p>
+      <w:pPr>
+        <w:pStyle w:val="ListParagraph"/>
+        <w:numPr>
+          <w:ilvl w:val="0"/>
+          <w:numId w:val="10"/>
+        </w:numPr>
+      </w:pPr>
+      <w:r>
+        <w:t xml:space="preserve">Click </w:t>
+      </w:r>
+      <w:r>
+        <w:rPr>
+          <w:b/>
+          <w:bCs/>
+        </w:rPr>
+        <w:t>Add</w:t>
+      </w:r>
+    </w:p>
+    <w:p>
+      <w:pPr>
+        <w:pStyle w:val="ListParagraph"/>
+        <w:numPr>
+          <w:ilvl w:val="0"/>
+          <w:numId w:val="10"/>
+        </w:numPr>
+      </w:pPr>
+      <w:r>
+        <w:rPr>
+          <w:b/>
+          <w:bCs/>
+        </w:rPr>
+        <w:t>CRUCIAL:</w:t>
+      </w:r>
+      <w:r>
+        <w:t xml:space="preserve"> Copy the string inside the </w:t>
+      </w:r>
+      <w:r>
+        <w:rPr>
+          <w:b/>
+          <w:bCs/>
+        </w:rPr>
+        <w:t>Value</w:t>
+      </w:r>
+      <w:r>
+        <w:t xml:space="preserve"> column immediately</w:t>
+      </w:r>
+      <w:r>
+        <w:t xml:space="preserve"> and save it to a secure place</w:t>
+      </w:r>
+      <w:r>
+        <w:t xml:space="preserve">. (Once you leave this page, the Value is permanently masked with </w:t>
+      </w:r>
+      <w:r>
+        <w:t>asterisks,</w:t>
+      </w:r>
+      <w:r>
+        <w:t xml:space="preserve"> and you can never retrieve it again)</w:t>
+      </w:r>
+    </w:p>
+    <w:p>
+      <w:pPr>
+        <w:pStyle w:val="ListParagraph"/>
+        <w:numPr>
+          <w:ilvl w:val="0"/>
+          <w:numId w:val="10"/>
+        </w:numPr>
+      </w:pPr>
+      <w:r>
+        <w:t>Now o</w:t>
+      </w:r>
+      <w:r>
+        <w:t xml:space="preserve">n the left menu, click </w:t>
+      </w:r>
+      <w:r>
+        <w:rPr>
+          <w:b/>
+          <w:bCs/>
+        </w:rPr>
+        <w:t>API permissions</w:t>
+      </w:r>
+    </w:p>
+    <w:p>
+      <w:pPr>
+        <w:pStyle w:val="ListParagraph"/>
+        <w:numPr>
+          <w:ilvl w:val="0"/>
+          <w:numId w:val="10"/>
+        </w:numPr>
+      </w:pPr>
+      <w:r>
+        <w:t xml:space="preserve">By default, the app will have a basic delegated permission (User.Read). Click </w:t>
+      </w:r>
+      <w:r>
+        <w:rPr>
+          <w:b/>
+          <w:bCs/>
+        </w:rPr>
+        <w:t>+ Add a permission</w:t>
+      </w:r>
+    </w:p>
+    <w:p>
+      <w:pPr>
+        <w:pStyle w:val="ListParagraph"/>
+        <w:numPr>
+          <w:ilvl w:val="0"/>
+          <w:numId w:val="10"/>
+        </w:numPr>
+      </w:pPr>
+      <w:r>
+        <w:lastRenderedPageBreak/>
+        <w:t xml:space="preserve">Select </w:t>
+      </w:r>
+      <w:r>
+        <w:rPr>
+          <w:b/>
+          <w:bCs/>
+        </w:rPr>
+        <w:t>Microsoft Graph</w:t>
+      </w:r>
+      <w:r>
+        <w:t xml:space="preserve"> from the list of available APIs</w:t>
+      </w:r>
+    </w:p>
+    <w:p>
+      <w:pPr>
+        <w:pStyle w:val="ListParagraph"/>
+        <w:numPr>
+          <w:ilvl w:val="0"/>
+          <w:numId w:val="10"/>
+        </w:numPr>
+      </w:pPr>
+      <w:r>
+        <w:t xml:space="preserve">Choose </w:t>
+      </w:r>
+      <w:r>
+        <w:rPr>
+          <w:b/>
+          <w:bCs/>
+        </w:rPr>
+        <w:t>Application permissions</w:t>
+      </w:r>
+    </w:p>
+    <w:p>
+      <w:pPr>
+        <w:pStyle w:val="ListParagraph"/>
+        <w:numPr>
+          <w:ilvl w:val="0"/>
+          <w:numId w:val="10"/>
+        </w:numPr>
+      </w:pPr>
+      <w:r>
+        <w:t>In the search box, type: Policy.ReadWrite.AuthenticationMethod</w:t>
+      </w:r>
+    </w:p>
+    <w:p>
+      <w:pPr>
+        <w:pStyle w:val="ListParagraph"/>
+        <w:numPr>
+          <w:ilvl w:val="0"/>
+          <w:numId w:val="10"/>
+        </w:numPr>
+      </w:pPr>
+      <w:r>
+        <w:t xml:space="preserve">Expand the </w:t>
+      </w:r>
+      <w:r>
+        <w:rPr>
+          <w:b/>
+          <w:bCs/>
+        </w:rPr>
+        <w:t>Policy</w:t>
+      </w:r>
+      <w:r>
+        <w:t xml:space="preserve"> section, check the box next to Policy.ReadWrite.AuthenticationMethod, and click </w:t>
+      </w:r>
+      <w:r>
+        <w:rPr>
+          <w:b/>
+          <w:bCs/>
+        </w:rPr>
+        <w:t>Add permissions</w:t>
+      </w:r>
+      <w:r>
+        <w:t xml:space="preserve"> at the bottom</w:t>
+      </w:r>
+      <w:r>
+        <w:br/>
+      </w:r>
+      <w:r>
+        <w:drawing>
+          <wp:inline distT="0" distB="0" distL="0" distR="0" wp14:anchorId="202E63B9" wp14:editId="7674F1AD">
+            <wp:extent cx="5731510" cy="3674110"/>
+            <wp:effectExtent l="0" t="0" r="2540" b="2540"/>
+            <wp:docPr id="1065951831" name="Picture 1"/>
+            <wp:cNvGraphicFramePr>
+              <a:graphicFrameLocks xmlns:a="http://schemas.openxmlformats.org/drawingml/2006/main" noChangeAspect="1"/>
+            </wp:cNvGraphicFramePr>
+            <a:graphic xmlns:a="http://schemas.openxmlformats.org/drawingml/2006/main">
+              <a:graphicData uri="http://schemas.openxmlformats.org/drawingml/2006/picture">
+                <pic:pic xmlns:pic="http://schemas.openxmlformats.org/drawingml/2006/picture">
+                  <pic:nvPicPr>
+                    <pic:cNvPr id="1065951831" name=""/>
+                    <pic:cNvPicPr/>
+                  </pic:nvPicPr>
+                  <pic:blipFill>
+                    <a:blip r:embed="rId13"/>
+                    <a:stretch>
+                      <a:fillRect/>
+                    </a:stretch>
+                  </pic:blipFill>
+                  <pic:spPr>
+                    <a:xfrm>
+                      <a:off x="0" y="0"/>
+                      <a:ext cx="5731510" cy="3674110"/>
+                    </a:xfrm>
+                    <a:prstGeom prst="rect">
+                      <a:avLst/>
+                    </a:prstGeom>
+                  </pic:spPr>
+                </pic:pic>
+              </a:graphicData>
+            </a:graphic>
+          </wp:inline>
+        </w:drawing>
+      </w:r>
+    </w:p>
+    <w:p>
+      <w:pPr>
+        <w:pStyle w:val="ListParagraph"/>
+        <w:numPr>
+          <w:ilvl w:val="0"/>
+          <w:numId w:val="10"/>
+        </w:numPr>
+      </w:pPr>
+      <w:r>
+        <w:t xml:space="preserve">You will return to the permissions table, and the status will show </w:t>
+      </w:r>
+      <w:r>
+        <w:rPr>
+          <w:i/>
+          <w:iCs/>
+        </w:rPr>
+        <w:t>Not granted for [Your Org]</w:t>
+      </w:r>
+    </w:p>
+    <w:p>
+      <w:pPr>
+        <w:pStyle w:val="ListParagraph"/>
+        <w:numPr>
+          <w:ilvl w:val="0"/>
+          <w:numId w:val="10"/>
+        </w:numPr>
+      </w:pPr>
+      <w:r>
+        <w:t xml:space="preserve">Click the button right above the table that says </w:t>
+      </w:r>
+      <w:r>
+        <w:rPr>
+          <w:b/>
+          <w:bCs/>
+        </w:rPr>
+        <w:t>Grant admin consent for [Your Org Name]</w:t>
+      </w:r>
+    </w:p>
+    <w:p>
+      <w:pPr>
+        <w:pStyle w:val="ListParagraph"/>
+        <w:numPr>
+          <w:ilvl w:val="0"/>
+          <w:numId w:val="10"/>
+        </w:numPr>
+      </w:pPr>
+      <w:r>
+        <w:t xml:space="preserve">Click </w:t>
+      </w:r>
+      <w:r>
+        <w:rPr>
+          <w:b/>
+          <w:bCs/>
+        </w:rPr>
+        <w:t>Yes</w:t>
+      </w:r>
+      <w:r>
+        <w:t xml:space="preserve"> when prompted to confirm</w:t>
+      </w:r>
+    </w:p>
+    <w:p>
+      <w:pPr>
+        <w:pStyle w:val="ListParagraph"/>
+        <w:numPr>
+          <w:ilvl w:val="0"/>
+          <w:numId w:val="10"/>
+        </w:numPr>
+      </w:pPr>
+      <w:r>
+        <w:t>The app should now be granted that permission.</w:t>
+      </w:r>
+    </w:p>
+    <w:p>
+      <w:pPr>
+        <w:pStyle w:val="ListParagraph"/>
+        <w:numPr>
+          <w:ilvl w:val="0"/>
+          <w:numId w:val="10"/>
+        </w:numPr>
+      </w:pPr>
+      <w:r>
+        <w:t xml:space="preserve">Now on the far-left menu click on </w:t>
+      </w:r>
+      <w:r>
+        <w:rPr>
+          <w:b/>
+          <w:bCs/>
+        </w:rPr>
+        <w:t>Roles &amp; admins</w:t>
+      </w:r>
+    </w:p>
+    <w:p>
+      <w:pPr>
+        <w:pStyle w:val="ListParagraph"/>
+        <w:numPr>
+          <w:ilvl w:val="0"/>
+          <w:numId w:val="10"/>
+        </w:numPr>
+      </w:pPr>
+      <w:r>
+        <w:t>In the search bar type “</w:t>
+      </w:r>
+      <w:r>
+        <w:t>Cloud Application Administrator</w:t>
+      </w:r>
+      <w:r>
+        <w:t>”</w:t>
+      </w:r>
+    </w:p>
+    <w:p>
+      <w:pPr>
+        <w:pStyle w:val="ListParagraph"/>
+        <w:numPr>
+          <w:ilvl w:val="0"/>
+          <w:numId w:val="10"/>
+        </w:numPr>
+      </w:pPr>
+      <w:r>
+        <w:t>Click on the role</w:t>
+      </w:r>
+    </w:p>
+    <w:p>
+      <w:pPr>
+        <w:pStyle w:val="ListParagraph"/>
+        <w:numPr>
+          <w:ilvl w:val="0"/>
+          <w:numId w:val="10"/>
+        </w:numPr>
+      </w:pPr>
+      <w:r>
+        <w:t xml:space="preserve">Click </w:t>
+      </w:r>
+      <w:r>
+        <w:rPr>
+          <w:b/>
+          <w:bCs/>
+        </w:rPr>
+        <w:t xml:space="preserve">+ </w:t>
+      </w:r>
+      <w:r>
+        <w:rPr>
+          <w:b/>
+          <w:bCs/>
+        </w:rPr>
+        <w:t>Add assignments</w:t>
+      </w:r>
+    </w:p>
+    <w:p>
+      <w:pPr>
+        <w:pStyle w:val="ListParagraph"/>
+        <w:numPr>
+          <w:ilvl w:val="0"/>
+          <w:numId w:val="10"/>
+        </w:numPr>
+      </w:pPr>
+      <w:r>
+        <w:t xml:space="preserve">in the search bar paste in your app registration’s </w:t>
+      </w:r>
+      <w:r>
+        <w:t>Application (client) ID</w:t>
+      </w:r>
+    </w:p>
+    <w:p>
+      <w:pPr>
+        <w:pStyle w:val="ListParagraph"/>
+        <w:numPr>
+          <w:ilvl w:val="0"/>
+          <w:numId w:val="10"/>
+        </w:numPr>
+      </w:pPr>
+      <w:r>
+        <w:t xml:space="preserve">Select the tick box next to your app registration and click </w:t>
+      </w:r>
+      <w:r>
+        <w:rPr>
+          <w:b/>
+          <w:bCs/>
+        </w:rPr>
+        <w:t>Add</w:t>
+      </w:r>
+    </w:p>
+    <w:p>
+      <w:pPr>
+        <w:pStyle w:val="ListParagraph"/>
+        <w:numPr>
+          <w:ilvl w:val="0"/>
+          <w:numId w:val="10"/>
+        </w:numPr>
+      </w:pPr>
+      <w:r>
+        <w:t>Your app registration should now have the Cloud Application Administrator role</w:t>
+      </w:r>
+    </w:p>
+    <w:p/>
+    <w:p>
+      <w:pPr>
+        <w:pStyle w:val="Heading1"/>
+      </w:pPr>
+      <w:r>
+        <w:lastRenderedPageBreak/>
+        <w:t xml:space="preserve">Plugging </w:t>
+      </w:r>
+      <w:r>
+        <w:t>app registration</w:t>
+      </w:r>
+      <w:r>
+        <w:t xml:space="preserve"> into Terraform</w:t>
       </w:r>
     </w:p>
     <w:p/>
@@ -2589,6 +3251,95 @@
     </w:lvl>
   </w:abstractNum>
   <w:abstractNum w:abstractNumId="4" w15:restartNumberingAfterBreak="0">
+    <w:nsid w:val="6A1333D3"/>
+    <w:multiLevelType w:val="hybridMultilevel"/>
+    <w:tmpl w:val="288E4292"/>
+    <w:lvl w:ilvl="0" w:tplc="0C09000F">
+      <w:start w:val="1"/>
+      <w:numFmt w:val="decimal"/>
+      <w:lvlText w:val="%1."/>
+      <w:lvlJc w:val="left"/>
+      <w:pPr>
+        <w:ind w:left="720" w:hanging="360"/>
+      </w:pPr>
+      <w:rPr>
+        <w:rFonts w:hint="default"/>
+      </w:rPr>
+    </w:lvl>
+    <w:lvl w:ilvl="1" w:tplc="0C090019" w:tentative="1">
+      <w:start w:val="1"/>
+      <w:numFmt w:val="lowerLetter"/>
+      <w:lvlText w:val="%2."/>
+      <w:lvlJc w:val="left"/>
+      <w:pPr>
+        <w:ind w:left="1440" w:hanging="360"/>
+      </w:pPr>
+    </w:lvl>
+    <w:lvl w:ilvl="2" w:tplc="0C09001B" w:tentative="1">
+      <w:start w:val="1"/>
+      <w:numFmt w:val="lowerRoman"/>
+      <w:lvlText w:val="%3."/>
+      <w:lvlJc w:val="right"/>
+      <w:pPr>
+        <w:ind w:left="2160" w:hanging="180"/>
+      </w:pPr>
+    </w:lvl>
+    <w:lvl w:ilvl="3" w:tplc="0C09000F" w:tentative="1">
+      <w:start w:val="1"/>
+      <w:numFmt w:val="decimal"/>
+      <w:lvlText w:val="%4."/>
+      <w:lvlJc w:val="left"/>
+      <w:pPr>
+        <w:ind w:left="2880" w:hanging="360"/>
+      </w:pPr>
+    </w:lvl>
+    <w:lvl w:ilvl="4" w:tplc="0C090019" w:tentative="1">
+      <w:start w:val="1"/>
+      <w:numFmt w:val="lowerLetter"/>
+      <w:lvlText w:val="%5."/>
+      <w:lvlJc w:val="left"/>
+      <w:pPr>
+        <w:ind w:left="3600" w:hanging="360"/>
+      </w:pPr>
+    </w:lvl>
+    <w:lvl w:ilvl="5" w:tplc="0C09001B" w:tentative="1">
+      <w:start w:val="1"/>
+      <w:numFmt w:val="lowerRoman"/>
+      <w:lvlText w:val="%6."/>
+      <w:lvlJc w:val="right"/>
+      <w:pPr>
+        <w:ind w:left="4320" w:hanging="180"/>
+      </w:pPr>
+    </w:lvl>
+    <w:lvl w:ilvl="6" w:tplc="0C09000F" w:tentative="1">
+      <w:start w:val="1"/>
+      <w:numFmt w:val="decimal"/>
+      <w:lvlText w:val="%7."/>
+      <w:lvlJc w:val="left"/>
+      <w:pPr>
+        <w:ind w:left="5040" w:hanging="360"/>
+      </w:pPr>
+    </w:lvl>
+    <w:lvl w:ilvl="7" w:tplc="0C090019" w:tentative="1">
+      <w:start w:val="1"/>
+      <w:numFmt w:val="lowerLetter"/>
+      <w:lvlText w:val="%8."/>
+      <w:lvlJc w:val="left"/>
+      <w:pPr>
+        <w:ind w:left="5760" w:hanging="360"/>
+      </w:pPr>
+    </w:lvl>
+    <w:lvl w:ilvl="8" w:tplc="0C09001B" w:tentative="1">
+      <w:start w:val="1"/>
+      <w:numFmt w:val="lowerRoman"/>
+      <w:lvlText w:val="%9."/>
+      <w:lvlJc w:val="right"/>
+      <w:pPr>
+        <w:ind w:left="6480" w:hanging="180"/>
+      </w:pPr>
+    </w:lvl>
+  </w:abstractNum>
+  <w:abstractNum w:abstractNumId="5" w15:restartNumberingAfterBreak="0">
     <w:nsid w:val="71546F28"/>
     <w:multiLevelType w:val="multilevel"/>
     <w:tmpl w:val="2488FDF0"/>
@@ -2701,7 +3452,7 @@
       </w:pPr>
     </w:lvl>
   </w:abstractNum>
-  <w:abstractNum w:abstractNumId="5" w15:restartNumberingAfterBreak="0">
+  <w:abstractNum w:abstractNumId="6" w15:restartNumberingAfterBreak="0">
     <w:nsid w:val="750B676A"/>
     <w:multiLevelType w:val="multilevel"/>
     <w:tmpl w:val="4E6AB570"/>
@@ -2850,7 +3601,7 @@
       </w:rPr>
     </w:lvl>
   </w:abstractNum>
-  <w:abstractNum w:abstractNumId="6" w15:restartNumberingAfterBreak="0">
+  <w:abstractNum w:abstractNumId="7" w15:restartNumberingAfterBreak="0">
     <w:nsid w:val="7DD7063E"/>
     <w:multiLevelType w:val="multilevel"/>
     <w:tmpl w:val="41409472"/>
@@ -2999,7 +3750,7 @@
       </w:rPr>
     </w:lvl>
   </w:abstractNum>
-  <w:abstractNum w:abstractNumId="7" w15:restartNumberingAfterBreak="0">
+  <w:abstractNum w:abstractNumId="8" w15:restartNumberingAfterBreak="0">
     <w:nsid w:val="7F1D4223"/>
     <w:multiLevelType w:val="multilevel"/>
     <w:tmpl w:val="09160DD4"/>
@@ -3148,7 +3899,7 @@
       </w:rPr>
     </w:lvl>
   </w:abstractNum>
-  <w:abstractNum w:abstractNumId="8" w15:restartNumberingAfterBreak="0">
+  <w:abstractNum w:abstractNumId="9" w15:restartNumberingAfterBreak="0">
     <w:nsid w:val="7FEA7AE3"/>
     <w:multiLevelType w:val="multilevel"/>
     <w:tmpl w:val="6FA817B4"/>
@@ -3159,7 +3910,7 @@
       <w:lvlText w:val="%1"/>
       <w:lvlJc w:val="left"/>
       <w:pPr>
-        <w:ind w:left="432" w:hanging="432"/>
+        <w:ind w:left="574" w:hanging="432"/>
       </w:pPr>
     </w:lvl>
     <w:lvl w:ilvl="1">
@@ -3244,13 +3995,13 @@
     </w:lvl>
   </w:abstractNum>
   <w:num w:numId="1" w16cid:durableId="1205020534">
-    <w:abstractNumId w:val="4"/>
+    <w:abstractNumId w:val="5"/>
   </w:num>
   <w:num w:numId="2" w16cid:durableId="1689990842">
     <w:abstractNumId w:val="1"/>
   </w:num>
   <w:num w:numId="3" w16cid:durableId="1008875452">
-    <w:abstractNumId w:val="6"/>
+    <w:abstractNumId w:val="7"/>
   </w:num>
   <w:num w:numId="4" w16cid:durableId="1327587866">
     <w:abstractNumId w:val="3"/>
@@ -3259,16 +4010,19 @@
     <w:abstractNumId w:val="2"/>
   </w:num>
   <w:num w:numId="6" w16cid:durableId="109201702">
-    <w:abstractNumId w:val="5"/>
+    <w:abstractNumId w:val="6"/>
   </w:num>
   <w:num w:numId="7" w16cid:durableId="18631078">
-    <w:abstractNumId w:val="7"/>
+    <w:abstractNumId w:val="8"/>
   </w:num>
   <w:num w:numId="8" w16cid:durableId="338578572">
     <w:abstractNumId w:val="0"/>
   </w:num>
   <w:num w:numId="9" w16cid:durableId="1640725401">
-    <w:abstractNumId w:val="8"/>
+    <w:abstractNumId w:val="9"/>
+  </w:num>
+  <w:num w:numId="10" w16cid:durableId="1306081250">
+    <w:abstractNumId w:val="4"/>
   </w:num>
 </w:numbering>
 </file>
@@ -4266,6 +5020,18 @@
       </w:tblBorders>
     </w:tblPr>
   </w:style>
+  <w:style w:type="character" w:styleId="FollowedHyperlink">
+    <w:name w:val="FollowedHyperlink"/>
+    <w:basedOn w:val="DefaultParagraphFont"/>
+    <w:uiPriority w:val="99"/>
+    <w:semiHidden/>
+    <w:unhideWhenUsed/>
+    <w:rsid w:val="009755E5"/>
+    <w:rPr>
+      <w:color w:val="96607D" w:themeColor="followedHyperlink"/>
+      <w:u w:val="single"/>
+    </w:rPr>
+  </w:style>
 </w:styles>
 </file>
 

</xml_diff>